<commit_message>
docs: regenerate docx for typed-context / key-id changes
Rebuild command-interface.docx and NCMP_개발상세서.docx from the updated .md
(typed per-mechanism contexts + key-id). pandoc gfm->docx --toc; validated via
zip integrity, content check (key_id / ncmp_ctx_gcm_t / NCMP_CTX_TYPE_GCM) and a
LibreOffice PDF render.

Co-Authored-By: Claude Opus 4.8 <noreply@anthropic.com>
</commit_message>
<xml_diff>
--- a/docs/NCMP_개발상세서.docx
+++ b/docs/NCMP_개발상세서.docx
@@ -23334,6 +23334,362 @@
       </w:r>
       <w:r>
         <w:t xml:space="preserve">)은 호출 간 토큰 상태가 없어(카운터·키·IV를 매 명령에 실어 보냄) 이 모델의 대상이 아니다.</w:t>
+      </w:r>
+    </w:p>
+    <w:p>
+      <w:pPr>
+        <w:pStyle w:val="BodyText"/>
+      </w:pPr>
+      <w:r>
+        <w:t xml:space="preserve">컨텍스트는 메커니즘별로 타입이 구분된 구조체이다(</w:t>
+      </w:r>
+      <w:r>
+        <w:rPr>
+          <w:rStyle w:val="VerbatimChar"/>
+        </w:rPr>
+        <w:t xml:space="preserve">ncmp/include/ncmp/ncmp_ctx.h</w:t>
+      </w:r>
+      <w:r>
+        <w:t xml:space="preserve">). 공통 8바이트 헤더</w:t>
+      </w:r>
+      <w:r>
+        <w:t xml:space="preserve"> </w:t>
+      </w:r>
+      <w:r>
+        <w:rPr>
+          <w:rStyle w:val="VerbatimChar"/>
+        </w:rPr>
+        <w:t xml:space="preserve">{type(u32)|len(u32)}</w:t>
+      </w:r>
+      <w:r>
+        <w:t xml:space="preserve">가 직렬화 blob을 선두에서 식별하며, 토큰과 데몬은 이 헤더의</w:t>
+      </w:r>
+      <w:r>
+        <w:t xml:space="preserve"> </w:t>
+      </w:r>
+      <w:r>
+        <w:rPr>
+          <w:rStyle w:val="VerbatimChar"/>
+        </w:rPr>
+        <w:t xml:space="preserve">type</w:t>
+      </w:r>
+      <w:r>
+        <w:t xml:space="preserve">으로 명령·메커니즘별 구조체를 선택한다. 표 6-9는 지원 컨텍스트를 정리한다.</w:t>
+      </w:r>
+    </w:p>
+    <w:p>
+      <w:pPr>
+        <w:pStyle w:val="BodyText"/>
+      </w:pPr>
+      <w:r>
+        <w:t xml:space="preserve">표 6-9. 메커니즘별 컨텍스트 구조체</w:t>
+      </w:r>
+    </w:p>
+    <w:tbl>
+      <w:tblPr>
+        <w:tblStyle w:val="Table"/>
+        <w:tblW w:type="pct" w:w="0.0"/>
+        <w:tblLook w:firstRow="1"/>
+      </w:tblPr>
+      <w:tblGrid/>
+      <w:tr>
+        <w:trPr>
+          <w:cnfStyle w:firstRow="1"/>
+        </w:trPr>
+        <w:tc>
+          <w:tcPr>
+            <w:tcBorders>
+              <w:bottom w:val="single"/>
+            </w:tcBorders>
+            <w:vAlign w:val="bottom"/>
+          </w:tcPr>
+          <w:p>
+            <w:pPr>
+              <w:pStyle w:val="Compact"/>
+              <w:jc w:val="left"/>
+            </w:pPr>
+            <w:r>
+              <w:t xml:space="preserve">type</w:t>
+            </w:r>
+          </w:p>
+        </w:tc>
+        <w:tc>
+          <w:tcPr>
+            <w:tcBorders>
+              <w:bottom w:val="single"/>
+            </w:tcBorders>
+            <w:vAlign w:val="bottom"/>
+          </w:tcPr>
+          <w:p>
+            <w:pPr>
+              <w:pStyle w:val="Compact"/>
+              <w:jc w:val="left"/>
+            </w:pPr>
+            <w:r>
+              <w:t xml:space="preserve">구조체</w:t>
+            </w:r>
+          </w:p>
+        </w:tc>
+        <w:tc>
+          <w:tcPr>
+            <w:tcBorders>
+              <w:bottom w:val="single"/>
+            </w:tcBorders>
+            <w:vAlign w:val="bottom"/>
+          </w:tcPr>
+          <w:p>
+            <w:pPr>
+              <w:pStyle w:val="Compact"/>
+              <w:jc w:val="left"/>
+            </w:pPr>
+            <w:r>
+              <w:t xml:space="preserve">필드</w:t>
+            </w:r>
+          </w:p>
+        </w:tc>
+        <w:tc>
+          <w:tcPr>
+            <w:tcBorders>
+              <w:bottom w:val="single"/>
+            </w:tcBorders>
+            <w:vAlign w:val="bottom"/>
+          </w:tcPr>
+          <w:p>
+            <w:pPr>
+              <w:pStyle w:val="Compact"/>
+              <w:jc w:val="left"/>
+            </w:pPr>
+            <w:r>
+              <w:t xml:space="preserve">직렬화 크기</w:t>
+            </w:r>
+          </w:p>
+        </w:tc>
+        <w:tc>
+          <w:tcPr>
+            <w:tcBorders>
+              <w:bottom w:val="single"/>
+            </w:tcBorders>
+            <w:vAlign w:val="bottom"/>
+          </w:tcPr>
+          <w:p>
+            <w:pPr>
+              <w:pStyle w:val="Compact"/>
+              <w:jc w:val="left"/>
+            </w:pPr>
+            <w:r>
+              <w:t xml:space="preserve">정의 위치</w:t>
+            </w:r>
+          </w:p>
+        </w:tc>
+      </w:tr>
+      <w:tr>
+        <w:tc>
+          <w:p>
+            <w:pPr>
+              <w:pStyle w:val="Compact"/>
+              <w:jc w:val="left"/>
+            </w:pPr>
+            <w:r>
+              <w:rPr>
+                <w:rStyle w:val="VerbatimChar"/>
+              </w:rPr>
+              <w:t xml:space="preserve">NCMP_CTX_TYPE_DIGEST</w:t>
+            </w:r>
+          </w:p>
+        </w:tc>
+        <w:tc>
+          <w:p>
+            <w:pPr>
+              <w:pStyle w:val="Compact"/>
+              <w:jc w:val="left"/>
+            </w:pPr>
+            <w:r>
+              <w:rPr>
+                <w:rStyle w:val="VerbatimChar"/>
+              </w:rPr>
+              <w:t xml:space="preserve">ncmp_ctx_digest_t</w:t>
+            </w:r>
+          </w:p>
+        </w:tc>
+        <w:tc>
+          <w:p>
+            <w:pPr>
+              <w:pStyle w:val="Compact"/>
+              <w:jc w:val="left"/>
+            </w:pPr>
+            <w:r>
+              <w:t xml:space="preserve">mech, acc</w:t>
+            </w:r>
+          </w:p>
+        </w:tc>
+        <w:tc>
+          <w:p>
+            <w:pPr>
+              <w:pStyle w:val="Compact"/>
+              <w:jc w:val="left"/>
+            </w:pPr>
+            <w:r>
+              <w:t xml:space="preserve">16 byte</w:t>
+            </w:r>
+          </w:p>
+        </w:tc>
+        <w:tc>
+          <w:p>
+            <w:pPr>
+              <w:pStyle w:val="Compact"/>
+              <w:jc w:val="left"/>
+            </w:pPr>
+            <w:r>
+              <w:rPr>
+                <w:rStyle w:val="VerbatimChar"/>
+              </w:rPr>
+              <w:t xml:space="preserve">ncmp_ctx.h</w:t>
+            </w:r>
+          </w:p>
+        </w:tc>
+      </w:tr>
+      <w:tr>
+        <w:tc>
+          <w:p>
+            <w:pPr>
+              <w:pStyle w:val="Compact"/>
+              <w:jc w:val="left"/>
+            </w:pPr>
+            <w:r>
+              <w:rPr>
+                <w:rStyle w:val="VerbatimChar"/>
+              </w:rPr>
+              <w:t xml:space="preserve">NCMP_CTX_TYPE_GCM</w:t>
+            </w:r>
+          </w:p>
+        </w:tc>
+        <w:tc>
+          <w:p>
+            <w:pPr>
+              <w:pStyle w:val="Compact"/>
+              <w:jc w:val="left"/>
+            </w:pPr>
+            <w:r>
+              <w:rPr>
+                <w:rStyle w:val="VerbatimChar"/>
+              </w:rPr>
+              <w:t xml:space="preserve">ncmp_ctx_gcm_t</w:t>
+            </w:r>
+          </w:p>
+        </w:tc>
+        <w:tc>
+          <w:p>
+            <w:pPr>
+              <w:pStyle w:val="Compact"/>
+              <w:jc w:val="left"/>
+            </w:pPr>
+            <w:r>
+              <w:t xml:space="preserve">key_id, acc, offset, enc, taglen, ivlen, iv[16]</w:t>
+            </w:r>
+          </w:p>
+        </w:tc>
+        <w:tc>
+          <w:p>
+            <w:pPr>
+              <w:pStyle w:val="Compact"/>
+              <w:jc w:val="left"/>
+            </w:pPr>
+            <w:r>
+              <w:t xml:space="preserve">39 byte</w:t>
+            </w:r>
+          </w:p>
+        </w:tc>
+        <w:tc>
+          <w:p>
+            <w:pPr>
+              <w:pStyle w:val="Compact"/>
+              <w:jc w:val="left"/>
+            </w:pPr>
+            <w:r>
+              <w:rPr>
+                <w:rStyle w:val="VerbatimChar"/>
+              </w:rPr>
+              <w:t xml:space="preserve">ncmp_ctx.h</w:t>
+            </w:r>
+          </w:p>
+        </w:tc>
+      </w:tr>
+    </w:tbl>
+    <w:p>
+      <w:pPr>
+        <w:pStyle w:val="BodyText"/>
+      </w:pPr>
+      <w:r>
+        <w:t xml:space="preserve">민감정보 보호(key-id 대체): 키는 컨텍스트에 담기지 않는다. 키는 토큰 키 테이블에 상주(HSM-resident)하고 GCM 컨텍스트는</w:t>
+      </w:r>
+      <w:r>
+        <w:t xml:space="preserve"> </w:t>
+      </w:r>
+      <w:r>
+        <w:rPr>
+          <w:rStyle w:val="VerbatimChar"/>
+        </w:rPr>
+        <w:t xml:space="preserve">key_id</w:t>
+      </w:r>
+      <w:r>
+        <w:t xml:space="preserve">만 참조한다. 따라서 미들웨어(comm_thread)가 저장·중계하는 컨텍스트에는 키 바이트가 존재하지 않는다. 키 바이트는 임포트 키 특성상</w:t>
+      </w:r>
+      <w:r>
+        <w:t xml:space="preserve"> </w:t>
+      </w:r>
+      <w:r>
+        <w:rPr>
+          <w:rStyle w:val="VerbatimChar"/>
+        </w:rPr>
+        <w:t xml:space="preserve">NCMP_CMD_AES_GCM_INIT</w:t>
+      </w:r>
+      <w:r>
+        <w:t xml:space="preserve"> </w:t>
+      </w:r>
+      <w:r>
+        <w:t xml:space="preserve">요청이 토큰으로 전달되는 순간에만 통과(전송 중)하며, 토큰은 이를 키 테이블에 등록(</w:t>
+      </w:r>
+      <w:r>
+        <w:rPr>
+          <w:rStyle w:val="VerbatimChar"/>
+        </w:rPr>
+        <w:t xml:space="preserve">mock_key_alloc</w:t>
+      </w:r>
+      <w:r>
+        <w:t xml:space="preserve">)하고</w:t>
+      </w:r>
+      <w:r>
+        <w:t xml:space="preserve"> </w:t>
+      </w:r>
+      <w:r>
+        <w:rPr>
+          <w:rStyle w:val="VerbatimChar"/>
+        </w:rPr>
+        <w:t xml:space="preserve">key_id</w:t>
+      </w:r>
+      <w:r>
+        <w:t xml:space="preserve">가 담긴 컨텍스트를 반환한다. FINAL과 CTX_FREE는 컨텍스트와 함께 해당 키를 해제(</w:t>
+      </w:r>
+      <w:r>
+        <w:rPr>
+          <w:rStyle w:val="VerbatimChar"/>
+        </w:rPr>
+        <w:t xml:space="preserve">mock_key_free</w:t>
+      </w:r>
+      <w:r>
+        <w:t xml:space="preserve">, 바이트 소거)한다. 이 불변식은 시험</w:t>
+      </w:r>
+      <w:r>
+        <w:t xml:space="preserve"> </w:t>
+      </w:r>
+      <w:r>
+        <w:rPr>
+          <w:rStyle w:val="VerbatimChar"/>
+        </w:rPr>
+        <w:t xml:space="preserve">test_ctx_typed.c</w:t>
+      </w:r>
+      <w:r>
+        <w:t xml:space="preserve">(직렬화 GCM 컨텍스트가 39바이트 고정이며 키 패턴이 존재하지 않음)로 검증한다.</w:t>
       </w:r>
     </w:p>
     <w:p>

</xml_diff>